<commit_message>
update info to 2024
</commit_message>
<xml_diff>
--- a/docs/abstract-conferenceusu.docx
+++ b/docs/abstract-conferenceusu.docx
@@ -10,8 +10,6 @@
           <w:b/>
         </w:rPr>
       </w:pPr>
-      <w:bookmarkStart w:id="0" w:name="_GoBack"/>
-      <w:bookmarkEnd w:id="0"/>
       <w:r>
         <w:rPr>
           <w:b/>
@@ -124,13 +122,19 @@
         <w:t>а</w:t>
       </w:r>
       <w:r>
-        <w:t>зывается в отдельной строке, принадлежность автора к соответствующей орг</w:t>
-      </w:r>
-      <w:r>
-        <w:t>а</w:t>
-      </w:r>
-      <w:r>
-        <w:t xml:space="preserve">низации указывается после ФИО автора в скобках надстрочным знаком </w:t>
+        <w:t>зывается в отдельной строке</w:t>
+      </w:r>
+      <w:r>
+        <w:t>, и п</w:t>
+      </w:r>
+      <w:r>
+        <w:t>ринадлежность автора к соответствующей о</w:t>
+      </w:r>
+      <w:r>
+        <w:t>р</w:t>
+      </w:r>
+      <w:r>
+        <w:t xml:space="preserve">ганизации указывается после ФИО автора в скобках надстрочным знаком </w:t>
       </w:r>
       <w:r>
         <w:rPr>
@@ -141,132 +145,246 @@
       <w:r>
         <w:t>.</w:t>
       </w:r>
-    </w:p>
-    <w:p>
-      <w:r>
-        <w:t>Рекомендуется оформлять текст тезисов непосредственно в шаблоне (не</w:t>
-      </w:r>
-      <w:r>
-        <w:t xml:space="preserve"> и</w:t>
-      </w:r>
-      <w:r>
-        <w:t>з</w:t>
-      </w:r>
-      <w:r>
-        <w:t>меняя</w:t>
-      </w:r>
-      <w:r>
-        <w:t xml:space="preserve"> параметр</w:t>
+      <w:r>
+        <w:t xml:space="preserve"> Е</w:t>
+      </w:r>
+      <w:r>
+        <w:t>с</w:t>
+      </w:r>
+      <w:r>
+        <w:t>ли все авторы из одной организации, надстрочных знаков не требуется (как в этом примере).</w:t>
+      </w:r>
+    </w:p>
+    <w:p>
+      <w:r>
+        <w:rPr>
+          <w:b/>
+        </w:rPr>
+        <w:t>Рекомендуется оформлять текст тезисов непосредственно в шаблоне</w:t>
+      </w:r>
+      <w:r>
+        <w:t xml:space="preserve">, </w:t>
+      </w:r>
+      <w:r>
+        <w:t>не</w:t>
+      </w:r>
+      <w:r>
+        <w:t xml:space="preserve"> изменяя</w:t>
+      </w:r>
+      <w:r>
+        <w:t xml:space="preserve"> </w:t>
+      </w:r>
+      <w:r>
+        <w:t xml:space="preserve">наши нестандартные </w:t>
+      </w:r>
+      <w:r>
+        <w:t>параметр</w:t>
       </w:r>
       <w:r>
         <w:t>ы</w:t>
       </w:r>
       <w:r>
-        <w:t xml:space="preserve"> страницы). </w:t>
-      </w:r>
-      <w:r>
-        <w:t>Основной текст тезисов отделяется пустой стр</w:t>
+        <w:t xml:space="preserve"> страницы</w:t>
+      </w:r>
+      <w:r>
+        <w:t xml:space="preserve">. </w:t>
+      </w:r>
+      <w:r>
+        <w:t>Основной текст тезисов о</w:t>
+      </w:r>
+      <w:r>
+        <w:t>т</w:t>
+      </w:r>
+      <w:r>
+        <w:t xml:space="preserve">деляется </w:t>
+      </w:r>
+      <w:r>
+        <w:t xml:space="preserve">от заголовка с </w:t>
+      </w:r>
+      <w:proofErr w:type="spellStart"/>
+      <w:r>
+        <w:t>аффилиациями</w:t>
+      </w:r>
+      <w:proofErr w:type="spellEnd"/>
+      <w:r>
+        <w:t xml:space="preserve"> </w:t>
+      </w:r>
+      <w:r>
+        <w:t>пустой строкой. Гарнитура</w:t>
+      </w:r>
+      <w:r>
+        <w:t xml:space="preserve"> </w:t>
+      </w:r>
+      <w:r>
+        <w:rPr>
+          <w:lang w:val="en-US"/>
+        </w:rPr>
+        <w:t>Times</w:t>
+      </w:r>
+      <w:r>
+        <w:t xml:space="preserve"> </w:t>
+      </w:r>
+      <w:r>
+        <w:rPr>
+          <w:lang w:val="en-US"/>
+        </w:rPr>
+        <w:t>New</w:t>
+      </w:r>
+      <w:r>
+        <w:t xml:space="preserve"> </w:t>
+      </w:r>
+      <w:r>
+        <w:rPr>
+          <w:lang w:val="en-US"/>
+        </w:rPr>
+        <w:t>Roman</w:t>
+      </w:r>
+      <w:r>
+        <w:t xml:space="preserve">, 11 </w:t>
+      </w:r>
+      <w:proofErr w:type="spellStart"/>
+      <w:r>
+        <w:rPr>
+          <w:lang w:val="en-US"/>
+        </w:rPr>
+        <w:t>pt</w:t>
+      </w:r>
+      <w:proofErr w:type="spellEnd"/>
+      <w:r>
+        <w:t xml:space="preserve">, </w:t>
+      </w:r>
+      <w:r>
+        <w:t>межстрочный интервал одинарный, выравнивание по ширине. О</w:t>
+      </w:r>
+      <w:r>
+        <w:t>т</w:t>
+      </w:r>
+      <w:r>
+        <w:t>ступ красной строки 0.5 см для каждого абзаца, кроме первого</w:t>
+      </w:r>
+      <w:r>
+        <w:t>, для которого он до</w:t>
+      </w:r>
+      <w:r>
+        <w:t>л</w:t>
+      </w:r>
+      <w:r>
+        <w:t>жен быть нулевым</w:t>
+      </w:r>
+      <w:r>
+        <w:t>.</w:t>
+      </w:r>
+      <w:r>
+        <w:t xml:space="preserve"> Автоматическая расстановка переносов для основного текста должна быть включ</w:t>
+      </w:r>
+      <w:r>
+        <w:t>е</w:t>
+      </w:r>
+      <w:r>
+        <w:t>на.</w:t>
+      </w:r>
+    </w:p>
+    <w:p>
+      <w:r>
+        <w:rPr>
+          <w:b/>
+        </w:rPr>
+        <w:t>Формулы, рисунки, схемы и таблицы</w:t>
+      </w:r>
+      <w:r>
+        <w:t xml:space="preserve"> вставляются после их непосре</w:t>
+      </w:r>
+      <w:r>
+        <w:t>д</w:t>
+      </w:r>
+      <w:r>
+        <w:t>ственно</w:t>
+      </w:r>
+      <w:r>
+        <w:t xml:space="preserve">го упоминания </w:t>
+      </w:r>
+      <w:r>
+        <w:t>и располагаются внутри текста</w:t>
+      </w:r>
+      <w:r>
+        <w:t xml:space="preserve"> (т.е., параметр «обтекание текстом» – «в тексте»)</w:t>
+      </w:r>
+      <w:r>
+        <w:t xml:space="preserve">. </w:t>
+      </w:r>
+      <w:r>
+        <w:t>Ссылк</w:t>
+      </w:r>
+      <w:r>
+        <w:t>и на них</w:t>
+      </w:r>
+      <w:r>
+        <w:t xml:space="preserve"> дела</w:t>
+      </w:r>
+      <w:r>
+        <w:t>ю</w:t>
+      </w:r>
+      <w:r>
+        <w:t>тся по усмотрению авт</w:t>
       </w:r>
       <w:r>
         <w:t>о</w:t>
       </w:r>
       <w:r>
-        <w:t>кой. Гарнитура</w:t>
+        <w:t xml:space="preserve">ров </w:t>
+      </w:r>
+      <w:r>
+        <w:t xml:space="preserve">либо </w:t>
+      </w:r>
+      <w:r>
+        <w:t>в скобках, например: (табл. 1)</w:t>
+      </w:r>
+      <w:r>
+        <w:t>,</w:t>
+      </w:r>
+      <w:r>
+        <w:t xml:space="preserve"> (рис.</w:t>
       </w:r>
       <w:r>
         <w:t xml:space="preserve"> </w:t>
       </w:r>
       <w:r>
-        <w:rPr>
-          <w:lang w:val="en-US"/>
-        </w:rPr>
-        <w:t>Times</w:t>
-      </w:r>
-      <w:r>
-        <w:t xml:space="preserve"> </w:t>
-      </w:r>
-      <w:r>
-        <w:rPr>
-          <w:lang w:val="en-US"/>
-        </w:rPr>
-        <w:t>New</w:t>
-      </w:r>
-      <w:r>
-        <w:t xml:space="preserve"> </w:t>
-      </w:r>
-      <w:r>
-        <w:rPr>
-          <w:lang w:val="en-US"/>
-        </w:rPr>
-        <w:t>Roman</w:t>
-      </w:r>
-      <w:r>
-        <w:t xml:space="preserve">, 11 </w:t>
-      </w:r>
-      <w:r>
-        <w:rPr>
-          <w:lang w:val="en-US"/>
-        </w:rPr>
-        <w:t>pt</w:t>
-      </w:r>
-      <w:r>
-        <w:t xml:space="preserve">, </w:t>
-      </w:r>
-      <w:r>
-        <w:t>межстрочный интервал одинарный, выра</w:t>
-      </w:r>
-      <w:r>
-        <w:t>в</w:t>
-      </w:r>
-      <w:r>
-        <w:t>нивание по ширине. Отступ красной строки 0.5 см для кажд</w:t>
-      </w:r>
-      <w:r>
-        <w:t>о</w:t>
-      </w:r>
-      <w:r>
-        <w:t>го абзаца, кроме первого</w:t>
-      </w:r>
-      <w:r>
-        <w:t>, для которого он должен быть нулевым</w:t>
+        <w:t>1)</w:t>
+      </w:r>
+      <w:r>
+        <w:t>, (см. таблицу) или (см. схему)</w:t>
+      </w:r>
+      <w:r>
+        <w:t>, либо прямо в тексте («На рисунке представлены…»)</w:t>
       </w:r>
       <w:r>
         <w:t>.</w:t>
       </w:r>
       <w:r>
-        <w:t xml:space="preserve"> Автоматическая расст</w:t>
-      </w:r>
-      <w:r>
-        <w:t>а</w:t>
-      </w:r>
-      <w:r>
-        <w:t>новка переносов для основного текста должна быть включена.</w:t>
-      </w:r>
-    </w:p>
-    <w:p>
-      <w:r>
-        <w:t>Формулы, рисунки, схемы и таблицы вставляются после их непосредственн</w:t>
-      </w:r>
-      <w:r>
-        <w:t>о</w:t>
-      </w:r>
-      <w:r>
-        <w:t>го упоминания в тексте, и располагаются внутри текста. Ссылка в тексте делае</w:t>
-      </w:r>
-      <w:r>
-        <w:t>т</w:t>
-      </w:r>
-      <w:r>
-        <w:t>ся по усмотрению авторов в скобках, например: (табл. 1) или (рис.</w:t>
-      </w:r>
-      <w:r>
-        <w:t xml:space="preserve"> </w:t>
-      </w:r>
-      <w:r>
-        <w:t>1).</w:t>
-      </w:r>
-      <w:r>
-        <w:t xml:space="preserve"> Таблицы и рисунки отделяются от основного текста пустой строкой.</w:t>
+        <w:t xml:space="preserve"> В любом случае, все р</w:t>
+      </w:r>
+      <w:r>
+        <w:t>и</w:t>
+      </w:r>
+      <w:r>
+        <w:t>сунки, схемы и таблицы должны быть обязательно упомянуты в те</w:t>
+      </w:r>
+      <w:r>
+        <w:t>к</w:t>
+      </w:r>
+      <w:r>
+        <w:t>сте.</w:t>
+      </w:r>
+    </w:p>
+    <w:p>
+      <w:r>
+        <w:t>Таблицы и рисунки отделяются от основного текста п</w:t>
+      </w:r>
+      <w:r>
+        <w:t>у</w:t>
+      </w:r>
+      <w:r>
+        <w:t>стой строкой.</w:t>
       </w:r>
     </w:p>
     <w:p/>
@@ -275,12 +393,13 @@
         <w:jc w:val="right"/>
       </w:pPr>
       <w:r>
-        <w:t>Таблица 1 – Название таблицы</w:t>
+        <w:t>Название таблицы</w:t>
       </w:r>
     </w:p>
     <w:tbl>
       <w:tblPr>
         <w:tblW w:w="0" w:type="auto"/>
+        <w:tblInd w:w="108" w:type="dxa"/>
         <w:tblBorders>
           <w:top w:val="single" w:sz="4" w:space="0" w:color="auto"/>
           <w:left w:val="single" w:sz="4" w:space="0" w:color="auto"/>
@@ -292,13 +411,13 @@
         <w:tblLook w:val="04A0" w:firstRow="1" w:lastRow="0" w:firstColumn="1" w:lastColumn="0" w:noHBand="0" w:noVBand="1"/>
       </w:tblPr>
       <w:tblGrid>
-        <w:gridCol w:w="3935"/>
-        <w:gridCol w:w="3935"/>
+        <w:gridCol w:w="3827"/>
+        <w:gridCol w:w="3828"/>
       </w:tblGrid>
       <w:tr>
         <w:tc>
           <w:tcPr>
-            <w:tcW w:w="3935" w:type="dxa"/>
+            <w:tcW w:w="3827" w:type="dxa"/>
             <w:shd w:val="clear" w:color="auto" w:fill="auto"/>
           </w:tcPr>
           <w:p>
@@ -310,7 +429,7 @@
         </w:tc>
         <w:tc>
           <w:tcPr>
-            <w:tcW w:w="3935" w:type="dxa"/>
+            <w:tcW w:w="3828" w:type="dxa"/>
             <w:shd w:val="clear" w:color="auto" w:fill="auto"/>
           </w:tcPr>
           <w:p>
@@ -337,7 +456,7 @@
           <w:lang w:eastAsia="ru-RU"/>
         </w:rPr>
         <w:drawing>
-          <wp:inline distT="0" distB="0" distL="0" distR="0">
+          <wp:inline distT="0" distB="0" distL="0" distR="0" wp14:anchorId="3AD738DC" wp14:editId="6DAD1AFF">
             <wp:extent cx="895350" cy="895350"/>
             <wp:effectExtent l="0" t="0" r="0" b="0"/>
             <wp:docPr id="1" name="Рисунок 2" descr="Ru 2018"/>
@@ -391,22 +510,144 @@
         <w:jc w:val="center"/>
       </w:pPr>
       <w:r>
-        <w:t xml:space="preserve">Рисунок </w:t>
-      </w:r>
-      <w:r>
-        <w:t>1 – Название рисунка</w:t>
+        <w:t>Название рисунка</w:t>
       </w:r>
     </w:p>
     <w:p/>
     <w:p>
       <w:r>
-        <w:t>Рекомендуется исключить цитирование литературы в тексте тезисов докл</w:t>
+        <w:rPr>
+          <w:b/>
+        </w:rPr>
+        <w:t>Нумерация формул</w:t>
+      </w:r>
+      <w:r>
+        <w:t xml:space="preserve"> не требуется, но допускается в случае необходимости.</w:t>
+      </w:r>
+      <w:r>
+        <w:t xml:space="preserve"> </w:t>
+      </w:r>
+      <w:r>
+        <w:rPr>
+          <w:b/>
+        </w:rPr>
+        <w:t>Нумерация рисунков, схем и таблиц</w:t>
+      </w:r>
+      <w:r>
+        <w:t xml:space="preserve"> </w:t>
+      </w:r>
+      <w:proofErr w:type="gramStart"/>
+      <w:r>
+        <w:t>нужна</w:t>
+      </w:r>
+      <w:proofErr w:type="gramEnd"/>
+      <w:r>
+        <w:t xml:space="preserve"> только если в тексте тезисов их несколько (например, две таблицы или два рисунка).</w:t>
+      </w:r>
+      <w:r>
+        <w:t xml:space="preserve"> В этом случае соотве</w:t>
+      </w:r>
+      <w:r>
+        <w:t>т</w:t>
+      </w:r>
+      <w:r>
+        <w:t xml:space="preserve">ствующие заголовки записываются в формате: </w:t>
+      </w:r>
+      <w:r>
+        <w:t>«</w:t>
+      </w:r>
+      <w:r>
+        <w:t>Рисунок 1. Заголовок рисунка</w:t>
+      </w:r>
+      <w:r>
+        <w:t>»</w:t>
+      </w:r>
+      <w:r>
+        <w:t xml:space="preserve"> </w:t>
+      </w:r>
+      <w:r>
+        <w:lastRenderedPageBreak/>
+        <w:t xml:space="preserve">для рисунков, </w:t>
+      </w:r>
+      <w:r>
+        <w:t>«</w:t>
+      </w:r>
+      <w:r>
+        <w:t>Таблица 1. Заголовок таблицы</w:t>
+      </w:r>
+      <w:r>
+        <w:t>»</w:t>
+      </w:r>
+      <w:r>
+        <w:t xml:space="preserve"> для таблиц, и </w:t>
+      </w:r>
+      <w:r>
+        <w:t>«</w:t>
+      </w:r>
+      <w:r>
+        <w:t>Схема</w:t>
+      </w:r>
+      <w:r>
+        <w:t xml:space="preserve"> 1. Загол</w:t>
+      </w:r>
+      <w:r>
+        <w:t>о</w:t>
+      </w:r>
+      <w:r>
+        <w:t xml:space="preserve">вок </w:t>
+      </w:r>
+      <w:r>
+        <w:t>схемы</w:t>
+      </w:r>
+      <w:r>
+        <w:t>»</w:t>
+      </w:r>
+      <w:r>
+        <w:t xml:space="preserve"> для схем</w:t>
+      </w:r>
+      <w:r>
+        <w:t xml:space="preserve"> (без кавычек)</w:t>
+      </w:r>
+      <w:r>
+        <w:t>.</w:t>
+      </w:r>
+      <w:r>
+        <w:t xml:space="preserve"> </w:t>
+      </w:r>
+      <w:r>
+        <w:t>Если рисунок или таблица в</w:t>
+      </w:r>
+      <w:r>
+        <w:t xml:space="preserve"> тексте тезисов в</w:t>
+      </w:r>
+      <w:r>
+        <w:t xml:space="preserve"> единственном экземпляре, их заголовки указываются как в примере выше, без нум</w:t>
+      </w:r>
+      <w:r>
+        <w:t>е</w:t>
+      </w:r>
+      <w:r>
+        <w:t>рации.</w:t>
+      </w:r>
+    </w:p>
+    <w:p>
+      <w:r>
+        <w:t xml:space="preserve">Рекомендуется исключить </w:t>
+      </w:r>
+      <w:r>
+        <w:rPr>
+          <w:b/>
+        </w:rPr>
+        <w:t>цитирование литературы</w:t>
+      </w:r>
+      <w:r>
+        <w:t xml:space="preserve"> в тексте тезисов докл</w:t>
       </w:r>
       <w:r>
         <w:t>а</w:t>
       </w:r>
       <w:r>
-        <w:t>дов. В случае крайней необходимости</w:t>
+        <w:t>дов. В случае необходимости</w:t>
       </w:r>
       <w:r>
         <w:t xml:space="preserve"> нумерованный</w:t>
@@ -415,46 +656,386 @@
         <w:t xml:space="preserve"> список литературы</w:t>
       </w:r>
       <w:r>
-        <w:t>, оформленный по ГОСТ,</w:t>
-      </w:r>
-      <w:r>
-        <w:t xml:space="preserve"> приводится после благодарностей.</w:t>
+        <w:t xml:space="preserve"> в формате, пр</w:t>
+      </w:r>
+      <w:r>
+        <w:t>и</w:t>
+      </w:r>
+      <w:r>
+        <w:t>ближенном к</w:t>
       </w:r>
       <w:r>
         <w:t xml:space="preserve"> </w:t>
       </w:r>
       <w:r>
+        <w:t xml:space="preserve">ГОСТ </w:t>
+      </w:r>
+      <w:proofErr w:type="gramStart"/>
+      <w:r>
+        <w:t>Р</w:t>
+      </w:r>
+      <w:proofErr w:type="gramEnd"/>
+      <w:r>
+        <w:t xml:space="preserve"> </w:t>
+      </w:r>
+      <w:r>
+        <w:t>7.0.5</w:t>
+      </w:r>
+      <w:r>
+        <w:t>-</w:t>
+      </w:r>
+      <w:r>
+        <w:t>2008</w:t>
+      </w:r>
+      <w:r>
+        <w:t>,</w:t>
+      </w:r>
+      <w:r>
+        <w:t xml:space="preserve"> приводится </w:t>
+      </w:r>
+      <w:r>
+        <w:t xml:space="preserve">непосредственно </w:t>
+      </w:r>
+      <w:r>
+        <w:t xml:space="preserve">после </w:t>
+      </w:r>
+      <w:r>
+        <w:t>основного текста, но п</w:t>
+      </w:r>
+      <w:r>
+        <w:t>е</w:t>
+      </w:r>
+      <w:r>
+        <w:t xml:space="preserve">ред текстом </w:t>
+      </w:r>
+      <w:r>
+        <w:t>благодарностей.</w:t>
+      </w:r>
+      <w:r>
+        <w:t xml:space="preserve"> Примеры</w:t>
+      </w:r>
+      <w:r>
+        <w:t xml:space="preserve"> </w:t>
+      </w:r>
+      <w:r>
+        <w:t>цитирования книг и статей:</w:t>
+      </w:r>
+    </w:p>
+    <w:p>
+      <w:r>
+        <w:t xml:space="preserve">1. </w:t>
+      </w:r>
+      <w:proofErr w:type="spellStart"/>
+      <w:r>
+        <w:t>Эткинс</w:t>
+      </w:r>
+      <w:proofErr w:type="spellEnd"/>
+      <w:r>
+        <w:t xml:space="preserve"> П. Физическая химия (том 1)</w:t>
+      </w:r>
+      <w:r>
+        <w:t>.</w:t>
+      </w:r>
+      <w:r>
+        <w:t xml:space="preserve"> </w:t>
+      </w:r>
+      <w:r>
+        <w:t>М.</w:t>
+      </w:r>
+      <w:proofErr w:type="gramStart"/>
+      <w:r>
+        <w:t xml:space="preserve"> :</w:t>
+      </w:r>
+      <w:proofErr w:type="gramEnd"/>
+      <w:r>
+        <w:t xml:space="preserve"> </w:t>
+      </w:r>
+      <w:r>
+        <w:t xml:space="preserve">Мир, 1980. </w:t>
+      </w:r>
+      <w:r>
+        <w:t>5</w:t>
+      </w:r>
+      <w:r>
+        <w:t>83 с.</w:t>
+      </w:r>
+    </w:p>
+    <w:p>
+      <w:r>
+        <w:rPr>
+          <w:lang w:val="en-US"/>
+        </w:rPr>
+        <w:t xml:space="preserve">2. </w:t>
+      </w:r>
+      <w:r>
+        <w:rPr>
+          <w:lang w:val="en-US"/>
+        </w:rPr>
+        <w:t xml:space="preserve">First A. B., Second C. D. The greatest article ever // The Journal. </w:t>
+      </w:r>
+      <w:r>
+        <w:t xml:space="preserve">2024. </w:t>
+      </w:r>
+      <w:proofErr w:type="gramStart"/>
+      <w:r>
+        <w:rPr>
+          <w:lang w:val="en-US"/>
+        </w:rPr>
+        <w:t>Vol</w:t>
+      </w:r>
+      <w:r>
+        <w:t xml:space="preserve">. 23, </w:t>
+      </w:r>
+      <w:proofErr w:type="spellStart"/>
+      <w:r>
+        <w:rPr>
+          <w:lang w:val="en-US"/>
+        </w:rPr>
+        <w:t>N</w:t>
+      </w:r>
+      <w:r>
+        <w:rPr>
+          <w:lang w:val="en-US"/>
+        </w:rPr>
+        <w:t>r</w:t>
+      </w:r>
+      <w:proofErr w:type="spellEnd"/>
+      <w:r>
+        <w:t xml:space="preserve"> 1.</w:t>
+      </w:r>
+      <w:proofErr w:type="gramEnd"/>
+      <w:r>
+        <w:t xml:space="preserve"> </w:t>
+      </w:r>
+      <w:r>
+        <w:rPr>
+          <w:lang w:val="en-US"/>
+        </w:rPr>
+        <w:t>P</w:t>
+      </w:r>
+      <w:r>
+        <w:t xml:space="preserve">. </w:t>
+      </w:r>
+      <w:r>
+        <w:t>1–2.</w:t>
+      </w:r>
+    </w:p>
+    <w:p>
+      <w:r>
+        <w:t xml:space="preserve">При желании можно дополнительно </w:t>
+      </w:r>
+      <w:r>
+        <w:t>приводить</w:t>
+      </w:r>
+      <w:r>
+        <w:t xml:space="preserve"> </w:t>
+      </w:r>
+      <w:r>
+        <w:rPr>
+          <w:lang w:val="en-US"/>
+        </w:rPr>
+        <w:t>DOI</w:t>
+      </w:r>
+      <w:r>
+        <w:t xml:space="preserve"> </w:t>
+      </w:r>
+      <w:r>
+        <w:t>в формате «</w:t>
+      </w:r>
+      <w:r>
+        <w:rPr>
+          <w:lang w:val="en-US"/>
+        </w:rPr>
+        <w:t>https</w:t>
+      </w:r>
+      <w:r>
+        <w:t>://doi.org/</w:t>
+      </w:r>
+      <w:r>
+        <w:t xml:space="preserve">…». </w:t>
+      </w:r>
+      <w:r>
         <w:t>С</w:t>
       </w:r>
       <w:r>
-        <w:t>сылки на литерат</w:t>
-      </w:r>
-      <w:r>
-        <w:t>у</w:t>
-      </w:r>
-      <w:r>
-        <w:t>ру указываются по тексту в квадратных скобках [1] по мере появления в тексте.</w:t>
-      </w:r>
-    </w:p>
+        <w:t>сылки на литературу указываются по тексту в квадратных скобках [1] по мере появления в тек</w:t>
+      </w:r>
+      <w:r>
+        <w:t>ст</w:t>
+      </w:r>
+      <w:r>
+        <w:t>е.</w:t>
+      </w:r>
+      <w:r>
+        <w:t xml:space="preserve"> Так же, как и в случае с рисунками и таблицами, н</w:t>
+      </w:r>
+      <w:r>
+        <w:t xml:space="preserve">е допускается </w:t>
+      </w:r>
+      <w:r>
+        <w:t>приводить</w:t>
+      </w:r>
+      <w:r>
+        <w:t xml:space="preserve"> в списке литературы источники, на кот</w:t>
+      </w:r>
+      <w:r>
+        <w:t>о</w:t>
+      </w:r>
+      <w:r>
+        <w:t xml:space="preserve">рые нет ссылок </w:t>
+      </w:r>
+      <w:proofErr w:type="spellStart"/>
+      <w:r>
+        <w:t>в</w:t>
+      </w:r>
+      <w:proofErr w:type="spellEnd"/>
+      <w:r>
+        <w:t xml:space="preserve"> те</w:t>
+      </w:r>
+      <w:r>
+        <w:t>к</w:t>
+      </w:r>
+      <w:r>
+        <w:t>сте.</w:t>
+      </w:r>
+    </w:p>
+    <w:p>
+      <w:r>
+        <w:rPr>
+          <w:i/>
+        </w:rPr>
+        <w:t xml:space="preserve">Благодарности и </w:t>
+      </w:r>
+      <w:r>
+        <w:rPr>
+          <w:i/>
+        </w:rPr>
+        <w:t xml:space="preserve">ссылки на </w:t>
+      </w:r>
+      <w:r>
+        <w:rPr>
+          <w:i/>
+        </w:rPr>
+        <w:t>гранты, если таковые имеются, указываются после текста тезисов</w:t>
+      </w:r>
+      <w:r>
+        <w:rPr>
+          <w:i/>
+        </w:rPr>
+        <w:t xml:space="preserve"> (т.е. </w:t>
+      </w:r>
+      <w:r>
+        <w:rPr>
+          <w:i/>
+        </w:rPr>
+        <w:t xml:space="preserve">и </w:t>
+      </w:r>
+      <w:bookmarkStart w:id="0" w:name="_GoBack"/>
+      <w:bookmarkEnd w:id="0"/>
+      <w:r>
+        <w:rPr>
+          <w:i/>
+        </w:rPr>
+        <w:t xml:space="preserve">после списка литературы, если он </w:t>
+      </w:r>
+      <w:r>
+        <w:rPr>
+          <w:i/>
+        </w:rPr>
+        <w:t>присутствует</w:t>
+      </w:r>
+      <w:r>
+        <w:rPr>
+          <w:i/>
+        </w:rPr>
+        <w:t>)</w:t>
+      </w:r>
+      <w:r>
+        <w:rPr>
+          <w:i/>
+        </w:rPr>
+        <w:t>. Начертание – курсив, выравнивание по ш</w:t>
+      </w:r>
+      <w:r>
+        <w:rPr>
+          <w:i/>
+        </w:rPr>
+        <w:t>и</w:t>
+      </w:r>
+      <w:r>
+        <w:rPr>
+          <w:i/>
+        </w:rPr>
+        <w:t>рине.</w:t>
+      </w:r>
+    </w:p>
+    <w:p/>
+    <w:p/>
     <w:p>
       <w:pPr>
         <w:rPr>
           <w:b/>
+          <w:color w:val="FF0000"/>
         </w:rPr>
       </w:pPr>
       <w:r>
         <w:rPr>
           <w:b/>
-        </w:rPr>
-        <w:t>Текст тезисов должен занимать не более одной страницы.</w:t>
-      </w:r>
-    </w:p>
-    <w:p>
-      <w:r>
-        <w:t>Оформленные должным образом</w:t>
-      </w:r>
-      <w:r>
-        <w:t xml:space="preserve"> и сохраненные в формате </w:t>
+          <w:color w:val="FF0000"/>
+        </w:rPr>
+        <w:t>Текст тезисов должен занимать не более одной страницы</w:t>
+      </w:r>
+      <w:r>
+        <w:t xml:space="preserve"> (</w:t>
+      </w:r>
+      <w:r>
+        <w:t>одной такой страницы как в этом шаблоне</w:t>
+      </w:r>
+      <w:r>
+        <w:t>)</w:t>
+      </w:r>
+      <w:r>
+        <w:t>.</w:t>
+      </w:r>
+      <w:r>
+        <w:t xml:space="preserve"> </w:t>
+      </w:r>
+      <w:r>
+        <w:rPr>
+          <w:b/>
+          <w:color w:val="FF0000"/>
+        </w:rPr>
+        <w:t>Не допускается махинаций</w:t>
+      </w:r>
+      <w:r>
+        <w:rPr>
+          <w:color w:val="FF0000"/>
+        </w:rPr>
+        <w:t xml:space="preserve"> </w:t>
+      </w:r>
+      <w:r>
+        <w:t xml:space="preserve">с размером шрифта, </w:t>
+      </w:r>
+      <w:proofErr w:type="spellStart"/>
+      <w:r>
+        <w:t>межбуквенным</w:t>
+      </w:r>
+      <w:proofErr w:type="spellEnd"/>
+      <w:r>
+        <w:t xml:space="preserve"> расстоянием, межстрочным расстоянием, отступами, и пр., и пр. для того, чтобы вместить текст в одну стр</w:t>
+      </w:r>
+      <w:r>
+        <w:t>а</w:t>
+      </w:r>
+      <w:r>
+        <w:t>ницу.</w:t>
+      </w:r>
+    </w:p>
+    <w:p/>
+    <w:p/>
+    <w:p>
+      <w:r>
+        <w:t xml:space="preserve">Оформленные должным образом и сохраненные в формате </w:t>
       </w:r>
       <w:r>
         <w:t>*.</w:t>
@@ -474,20 +1055,30 @@
       <w:r>
         <w:t>*.</w:t>
       </w:r>
+      <w:proofErr w:type="spellStart"/>
       <w:r>
         <w:rPr>
           <w:lang w:val="en-US"/>
         </w:rPr>
         <w:t>docx</w:t>
       </w:r>
+      <w:proofErr w:type="spellEnd"/>
       <w:r>
         <w:t xml:space="preserve"> (например, </w:t>
       </w:r>
+      <w:proofErr w:type="spellStart"/>
       <w:r>
         <w:rPr>
           <w:b/>
         </w:rPr>
-        <w:t>Иванов_УрФУ.</w:t>
+        <w:t>Иванов_УрФУ</w:t>
+      </w:r>
+      <w:proofErr w:type="spellEnd"/>
+      <w:r>
+        <w:rPr>
+          <w:b/>
+        </w:rPr>
+        <w:t>.</w:t>
       </w:r>
       <w:r>
         <w:rPr>
@@ -497,71 +1088,198 @@
         <w:t>doc</w:t>
       </w:r>
       <w:r>
-        <w:t xml:space="preserve">) </w:t>
-      </w:r>
-      <w:r>
-        <w:t xml:space="preserve">тезисы отправляются на </w:t>
-      </w:r>
+        <w:t xml:space="preserve">) прикрепляются на портале молодежной науки </w:t>
+      </w:r>
+      <w:proofErr w:type="spellStart"/>
+      <w:r>
+        <w:t>УрФУ</w:t>
+      </w:r>
+      <w:proofErr w:type="spellEnd"/>
+      <w:r>
+        <w:t xml:space="preserve"> (доступно как во время регистрации, так и после отправки регистрацио</w:t>
+      </w:r>
+      <w:r>
+        <w:t>н</w:t>
+      </w:r>
+      <w:r>
+        <w:t>ной формы)</w:t>
+      </w:r>
+      <w:r>
+        <w:t>.</w:t>
+      </w:r>
+    </w:p>
+    <w:p/>
+    <w:p/>
+    <w:p>
       <w:r>
         <w:rPr>
           <w:lang w:val="en-US"/>
         </w:rPr>
-        <w:t>e</w:t>
-      </w:r>
-      <w:r>
-        <w:t>-</w:t>
-      </w:r>
-      <w:r>
-        <w:rPr>
+        <w:t>PS</w:t>
+      </w:r>
+      <w:r>
+        <w:t xml:space="preserve">: </w:t>
+      </w:r>
+      <w:r>
+        <w:t>Для многих нижеизложенное очевидно, но, как показывает наша практ</w:t>
+      </w:r>
+      <w:r>
+        <w:t>и</w:t>
+      </w:r>
+      <w:r>
+        <w:t>ка работы с тезисами и статьями, не для всех. П</w:t>
+      </w:r>
+      <w:r>
+        <w:t xml:space="preserve">ри оформлении тезисов </w:t>
+      </w:r>
+      <w:r>
+        <w:t>рек</w:t>
+      </w:r>
+      <w:r>
+        <w:t>о</w:t>
+      </w:r>
+      <w:r>
+        <w:t xml:space="preserve">мендуется </w:t>
+      </w:r>
+      <w:r>
+        <w:t>по возможности руководств</w:t>
+      </w:r>
+      <w:r>
+        <w:t>оваться</w:t>
+      </w:r>
+      <w:r>
+        <w:t xml:space="preserve"> здравым смыслом и </w:t>
+      </w:r>
+      <w:r>
+        <w:t>общеприн</w:t>
+      </w:r>
+      <w:r>
+        <w:t>я</w:t>
+      </w:r>
+      <w:r>
+        <w:t>тыми</w:t>
+      </w:r>
+      <w:r>
+        <w:t xml:space="preserve"> правилами оформления текстов для научных публикаций. </w:t>
+      </w:r>
+      <w:r>
+        <w:t>К примеру: р</w:t>
+      </w:r>
+      <w:r>
+        <w:t>и</w:t>
+      </w:r>
+      <w:r>
+        <w:t xml:space="preserve">сунки должны быть </w:t>
+      </w:r>
+      <w:r>
+        <w:t>четкими, и надписи на рисунках и схемах должны быть ч</w:t>
+      </w:r>
+      <w:r>
+        <w:t>и</w:t>
+      </w:r>
+      <w:r>
+        <w:t>таем</w:t>
+      </w:r>
+      <w:r>
+        <w:t>ы</w:t>
+      </w:r>
+      <w:r>
+        <w:t>ми. Физические величины в формулах и тексте записываются курсивом, между величиной и единицами измерения ставится пробел, и ноль, даже возв</w:t>
+      </w:r>
+      <w:r>
+        <w:t>е</w:t>
+      </w:r>
+      <w:r>
+        <w:t xml:space="preserve">денный в верхний индекс, не является символом градуса. Хороший пример: </w:t>
+      </w:r>
+      <w:proofErr w:type="gramStart"/>
+      <w:r>
+        <w:rPr>
+          <w:i/>
           <w:lang w:val="en-US"/>
         </w:rPr>
-        <w:t>mail</w:t>
-      </w:r>
-      <w:r>
-        <w:t xml:space="preserve"> </w:t>
-      </w:r>
-      <w:r>
-        <w:t xml:space="preserve">конференции: </w:t>
-      </w:r>
-      <w:hyperlink r:id="rId8" w:history="1">
-        <w:r>
-          <w:rPr>
-            <w:rStyle w:val="a9"/>
-          </w:rPr>
-          <w:t>ConferenceUSU@yandex.ru</w:t>
-        </w:r>
-      </w:hyperlink>
+        <w:t>T</w:t>
+      </w:r>
+      <w:proofErr w:type="spellStart"/>
+      <w:r>
+        <w:rPr>
+          <w:vertAlign w:val="subscript"/>
+        </w:rPr>
+        <w:t>пл</w:t>
+      </w:r>
+      <w:proofErr w:type="spellEnd"/>
+      <w:r>
+        <w:t>(</w:t>
+      </w:r>
+      <w:proofErr w:type="gramEnd"/>
+      <w:r>
+        <w:rPr>
+          <w:lang w:val="en-US"/>
+        </w:rPr>
+        <w:t>Au</w:t>
+      </w:r>
+      <w:r>
+        <w:t xml:space="preserve">) = </w:t>
+      </w:r>
+      <w:r>
+        <w:t>1064.18 °C</w:t>
+      </w:r>
+      <w:r>
+        <w:t xml:space="preserve">. Плохой пример: </w:t>
+      </w:r>
+      <w:proofErr w:type="gramStart"/>
+      <w:r>
+        <w:rPr>
+          <w:lang w:val="en-US"/>
+        </w:rPr>
+        <w:t>T</w:t>
+      </w:r>
+      <w:proofErr w:type="spellStart"/>
+      <w:r>
+        <w:rPr>
+          <w:vertAlign w:val="subscript"/>
+        </w:rPr>
+        <w:t>пл</w:t>
+      </w:r>
+      <w:proofErr w:type="spellEnd"/>
+      <w:r>
+        <w:t>(</w:t>
+      </w:r>
+      <w:proofErr w:type="gramEnd"/>
+      <w:r>
+        <w:rPr>
+          <w:i/>
+          <w:lang w:val="en-US"/>
+        </w:rPr>
+        <w:t>Au</w:t>
+      </w:r>
+      <w:r>
+        <w:rPr>
+          <w:i/>
+        </w:rPr>
+        <w:t>)</w:t>
+      </w:r>
+      <w:r>
+        <w:t>=</w:t>
+      </w:r>
+      <w:r>
+        <w:t>1064.18</w:t>
+      </w:r>
+      <w:r>
+        <w:rPr>
+          <w:vertAlign w:val="superscript"/>
+        </w:rPr>
+        <w:t>0</w:t>
+      </w:r>
+      <w:r>
+        <w:t>C</w:t>
+      </w:r>
       <w:r>
         <w:t>.</w:t>
       </w:r>
     </w:p>
-    <w:p>
-      <w:pPr>
-        <w:rPr>
-          <w:i/>
-        </w:rPr>
-      </w:pPr>
-      <w:r>
-        <w:rPr>
-          <w:i/>
-        </w:rPr>
-        <w:t>Благодарности и гранты, если таковые имеются, указываются после осно</w:t>
-      </w:r>
-      <w:r>
-        <w:rPr>
-          <w:i/>
-        </w:rPr>
-        <w:t>в</w:t>
-      </w:r>
-      <w:r>
-        <w:rPr>
-          <w:i/>
-        </w:rPr>
-        <w:t>ного текста тезисов. Начертание – курсив, выравнивание по ширине.</w:t>
-      </w:r>
-    </w:p>
     <w:sectPr>
-      <w:headerReference w:type="default" r:id="rId9"/>
+      <w:headerReference w:type="default" r:id="rId8"/>
       <w:pgSz w:w="9979" w:h="14175" w:code="259"/>
       <w:pgMar w:top="1701" w:right="1134" w:bottom="1418" w:left="1191" w:header="1276" w:footer="709" w:gutter="0"/>
       <w:cols w:space="708"/>
@@ -795,7 +1513,6 @@
   <w:style w:type="character" w:default="1" w:styleId="a0">
     <w:name w:val="Default Paragraph Font"/>
     <w:uiPriority w:val="1"/>
-    <w:semiHidden/>
     <w:unhideWhenUsed/>
   </w:style>
   <w:style w:type="table" w:default="1" w:styleId="a1">
@@ -1084,7 +1801,6 @@
   <w:style w:type="character" w:default="1" w:styleId="a0">
     <w:name w:val="Default Paragraph Font"/>
     <w:uiPriority w:val="1"/>
-    <w:semiHidden/>
     <w:unhideWhenUsed/>
   </w:style>
   <w:style w:type="table" w:default="1" w:styleId="a1">

</xml_diff>